<commit_message>
Swap the headshot for a Memoji and drop Trainee from the VIT title.
Co-authored-by: Cursor <cursoragent@cursor.com>
</commit_message>
<xml_diff>
--- a/public/Resume/Madhwaraj_Kulkarni_Resume.docx
+++ b/public/Resume/Madhwaraj_Kulkarni_Resume.docx
@@ -37,7 +37,7 @@
           <w:sz w:val="21"/>
           <w:szCs w:val="21"/>
         </w:rPr>
-        <w:t>Trainee | Aspiring</w:t>
+        <w:t>| Aspiring</w:t>
       </w:r>
       <w:r>
         <w:rPr>
@@ -124,7 +124,7 @@
         <w:rPr>
           <w:color w:val="000000"/>
         </w:rPr>
-        <w:t>Business Analyst Trainee with 1.5 years of experience in AI automation support, chatbot requirement gathering, and data analysis — looking to grow into AI Product Management at an early-stage startup. I have built foundational exposure to LLM tools, RPA workflows, and product thinking through real work and self-initiated projects, and I am eager to learn and contribute in a hands-on PM environment.</w:t>
+        <w:t>Business Analyst with 1.5 years of experience in AI automation support, chatbot requirement gathering, and data analysis — looking to grow into AI Product Management at an early-stage startup. I have built foundational exposure to LLM tools, RPA workflows, and product thinking through real work and self-initiated projects, and I am eager to learn and contribute in a hands-on PM environment.</w:t>
       </w:r>
     </w:p>
     <w:p>
@@ -178,7 +178,7 @@
           <w:iCs/>
           <w:color w:val="333333"/>
         </w:rPr>
-        <w:t>Business Analyst Trainee</w:t>
+        <w:t>Business Analyst</w:t>
       </w:r>
       <w:r>
         <w:rPr>

</xml_diff>